<commit_message>
add homework  0714 Django
</commit_message>
<xml_diff>
--- a/Django/0714/40_王大明_django作業1.docx
+++ b/Django/0714/40_王大明_django作業1.docx
@@ -1,6 +1,6 @@
 
 <file path=word/document.xml><?xml version="1.0" encoding="utf-8"?>
-<w:document xmlns:wpc="http://schemas.microsoft.com/office/word/2010/wordprocessingCanvas" xmlns:cx="http://schemas.microsoft.com/office/drawing/2014/chartex" xmlns:mc="http://schemas.openxmlformats.org/markup-compatibility/2006" xmlns:o="urn:schemas-microsoft-com:office:office" xmlns:r="http://schemas.openxmlformats.org/officeDocument/2006/relationships" xmlns:m="http://schemas.openxmlformats.org/officeDocument/2006/math" xmlns:v="urn:schemas-microsoft-com:vml" xmlns:wp14="http://schemas.microsoft.com/office/word/2010/wordprocessingDrawing" xmlns:wp="http://schemas.openxmlformats.org/drawingml/2006/wordprocessingDrawing" xmlns:w10="urn:schemas-microsoft-com:office:word" xmlns:w="http://schemas.openxmlformats.org/wordprocessingml/2006/main" xmlns:w14="http://schemas.microsoft.com/office/word/2010/wordml" xmlns:w15="http://schemas.microsoft.com/office/word/2012/wordml" xmlns:w16se="http://schemas.microsoft.com/office/word/2015/wordml/symex" xmlns:wpg="http://schemas.microsoft.com/office/word/2010/wordprocessingGroup" xmlns:wpi="http://schemas.microsoft.com/office/word/2010/wordprocessingInk" xmlns:wne="http://schemas.microsoft.com/office/word/2006/wordml" xmlns:wps="http://schemas.microsoft.com/office/word/2010/wordprocessingShape" mc:Ignorable="w14 w15 w16se wp14">
+<w:document xmlns:wpc="http://schemas.microsoft.com/office/word/2010/wordprocessingCanvas" xmlns:cx="http://schemas.microsoft.com/office/drawing/2014/chartex" xmlns:cx1="http://schemas.microsoft.com/office/drawing/2015/9/8/chartex" xmlns:cx2="http://schemas.microsoft.com/office/drawing/2015/10/21/chartex" xmlns:cx3="http://schemas.microsoft.com/office/drawing/2016/5/9/chartex" xmlns:cx4="http://schemas.microsoft.com/office/drawing/2016/5/10/chartex" xmlns:cx5="http://schemas.microsoft.com/office/drawing/2016/5/11/chartex" xmlns:cx6="http://schemas.microsoft.com/office/drawing/2016/5/12/chartex" xmlns:cx7="http://schemas.microsoft.com/office/drawing/2016/5/13/chartex" xmlns:cx8="http://schemas.microsoft.com/office/drawing/2016/5/14/chartex" xmlns:mc="http://schemas.openxmlformats.org/markup-compatibility/2006" xmlns:aink="http://schemas.microsoft.com/office/drawing/2016/ink" xmlns:am3d="http://schemas.microsoft.com/office/drawing/2017/model3d" xmlns:o="urn:schemas-microsoft-com:office:office" xmlns:oel="http://schemas.microsoft.com/office/2019/extlst" xmlns:r="http://schemas.openxmlformats.org/officeDocument/2006/relationships" xmlns:m="http://schemas.openxmlformats.org/officeDocument/2006/math" xmlns:v="urn:schemas-microsoft-com:vml" xmlns:wp14="http://schemas.microsoft.com/office/word/2010/wordprocessingDrawing" xmlns:wp="http://schemas.openxmlformats.org/drawingml/2006/wordprocessingDrawing" xmlns:w10="urn:schemas-microsoft-com:office:word" xmlns:w="http://schemas.openxmlformats.org/wordprocessingml/2006/main" xmlns:w14="http://schemas.microsoft.com/office/word/2010/wordml" xmlns:w15="http://schemas.microsoft.com/office/word/2012/wordml" xmlns:w16cex="http://schemas.microsoft.com/office/word/2018/wordml/cex" xmlns:w16cid="http://schemas.microsoft.com/office/word/2016/wordml/cid" xmlns:w16="http://schemas.microsoft.com/office/word/2018/wordml" xmlns:w16du="http://schemas.microsoft.com/office/word/2023/wordml/word16du" xmlns:w16sdtdh="http://schemas.microsoft.com/office/word/2020/wordml/sdtdatahash" xmlns:w16sdtfl="http://schemas.microsoft.com/office/word/2024/wordml/sdtformatlock" xmlns:w16se="http://schemas.microsoft.com/office/word/2015/wordml/symex" xmlns:wpg="http://schemas.microsoft.com/office/word/2010/wordprocessingGroup" xmlns:wpi="http://schemas.microsoft.com/office/word/2010/wordprocessingInk" xmlns:wne="http://schemas.microsoft.com/office/word/2006/wordml" xmlns:wps="http://schemas.microsoft.com/office/word/2010/wordprocessingShape" mc:Ignorable="w14 w15 w16se w16cid w16 w16cex w16sdtdh w16sdtfl w16du wp14">
   <w:body>
     <w:p>
       <w:pPr>
@@ -179,8 +179,6 @@
         </w:rPr>
         <w:t>myapp</w:t>
       </w:r>
-      <w:bookmarkStart w:id="0" w:name="_GoBack"/>
-      <w:bookmarkEnd w:id="0"/>
       <w:r>
         <w:rPr>
           <w:sz w:val="32"/>
@@ -196,6 +194,205 @@
       </w:pPr>
       <w:r>
         <w:rPr>
+          <w:noProof/>
+        </w:rPr>
+        <w:drawing>
+          <wp:inline distT="0" distB="0" distL="0" distR="0" wp14:anchorId="5A899ABB" wp14:editId="290E201C">
+            <wp:extent cx="5274310" cy="3524250"/>
+            <wp:effectExtent l="0" t="0" r="2540" b="0"/>
+            <wp:docPr id="2097611277" name="圖片 1"/>
+            <wp:cNvGraphicFramePr>
+              <a:graphicFrameLocks xmlns:a="http://schemas.openxmlformats.org/drawingml/2006/main" noChangeAspect="1"/>
+            </wp:cNvGraphicFramePr>
+            <a:graphic xmlns:a="http://schemas.openxmlformats.org/drawingml/2006/main">
+              <a:graphicData uri="http://schemas.openxmlformats.org/drawingml/2006/picture">
+                <pic:pic xmlns:pic="http://schemas.openxmlformats.org/drawingml/2006/picture">
+                  <pic:nvPicPr>
+                    <pic:cNvPr id="2097611277" name=""/>
+                    <pic:cNvPicPr/>
+                  </pic:nvPicPr>
+                  <pic:blipFill>
+                    <a:blip r:embed="rId6"/>
+                    <a:stretch>
+                      <a:fillRect/>
+                    </a:stretch>
+                  </pic:blipFill>
+                  <pic:spPr>
+                    <a:xfrm>
+                      <a:off x="0" y="0"/>
+                      <a:ext cx="5274310" cy="3524250"/>
+                    </a:xfrm>
+                    <a:prstGeom prst="rect">
+                      <a:avLst/>
+                    </a:prstGeom>
+                  </pic:spPr>
+                </pic:pic>
+              </a:graphicData>
+            </a:graphic>
+          </wp:inline>
+        </w:drawing>
+      </w:r>
+    </w:p>
+    <w:p>
+      <w:pPr>
+        <w:rPr>
+          <w:sz w:val="32"/>
+        </w:rPr>
+      </w:pPr>
+    </w:p>
+    <w:p>
+      <w:pPr>
+        <w:rPr>
+          <w:sz w:val="32"/>
+        </w:rPr>
+      </w:pPr>
+      <w:r>
+        <w:rPr>
+          <w:noProof/>
+        </w:rPr>
+        <w:lastRenderedPageBreak/>
+        <w:drawing>
+          <wp:inline distT="0" distB="0" distL="0" distR="0" wp14:anchorId="5C478F1C" wp14:editId="5216AC7A">
+            <wp:extent cx="5274310" cy="3524250"/>
+            <wp:effectExtent l="0" t="0" r="2540" b="0"/>
+            <wp:docPr id="1433966160" name="圖片 1"/>
+            <wp:cNvGraphicFramePr>
+              <a:graphicFrameLocks xmlns:a="http://schemas.openxmlformats.org/drawingml/2006/main" noChangeAspect="1"/>
+            </wp:cNvGraphicFramePr>
+            <a:graphic xmlns:a="http://schemas.openxmlformats.org/drawingml/2006/main">
+              <a:graphicData uri="http://schemas.openxmlformats.org/drawingml/2006/picture">
+                <pic:pic xmlns:pic="http://schemas.openxmlformats.org/drawingml/2006/picture">
+                  <pic:nvPicPr>
+                    <pic:cNvPr id="1433966160" name=""/>
+                    <pic:cNvPicPr/>
+                  </pic:nvPicPr>
+                  <pic:blipFill>
+                    <a:blip r:embed="rId7"/>
+                    <a:stretch>
+                      <a:fillRect/>
+                    </a:stretch>
+                  </pic:blipFill>
+                  <pic:spPr>
+                    <a:xfrm>
+                      <a:off x="0" y="0"/>
+                      <a:ext cx="5274310" cy="3524250"/>
+                    </a:xfrm>
+                    <a:prstGeom prst="rect">
+                      <a:avLst/>
+                    </a:prstGeom>
+                  </pic:spPr>
+                </pic:pic>
+              </a:graphicData>
+            </a:graphic>
+          </wp:inline>
+        </w:drawing>
+      </w:r>
+    </w:p>
+    <w:p>
+      <w:pPr>
+        <w:rPr>
+          <w:rFonts w:hint="eastAsia"/>
+          <w:sz w:val="32"/>
+        </w:rPr>
+      </w:pPr>
+      <w:r>
+        <w:rPr>
+          <w:noProof/>
+        </w:rPr>
+        <w:drawing>
+          <wp:inline distT="0" distB="0" distL="0" distR="0" wp14:anchorId="192AABFF" wp14:editId="4066C188">
+            <wp:extent cx="5274310" cy="3524250"/>
+            <wp:effectExtent l="0" t="0" r="2540" b="0"/>
+            <wp:docPr id="125605943" name="圖片 1"/>
+            <wp:cNvGraphicFramePr>
+              <a:graphicFrameLocks xmlns:a="http://schemas.openxmlformats.org/drawingml/2006/main" noChangeAspect="1"/>
+            </wp:cNvGraphicFramePr>
+            <a:graphic xmlns:a="http://schemas.openxmlformats.org/drawingml/2006/main">
+              <a:graphicData uri="http://schemas.openxmlformats.org/drawingml/2006/picture">
+                <pic:pic xmlns:pic="http://schemas.openxmlformats.org/drawingml/2006/picture">
+                  <pic:nvPicPr>
+                    <pic:cNvPr id="125605943" name=""/>
+                    <pic:cNvPicPr/>
+                  </pic:nvPicPr>
+                  <pic:blipFill>
+                    <a:blip r:embed="rId8"/>
+                    <a:stretch>
+                      <a:fillRect/>
+                    </a:stretch>
+                  </pic:blipFill>
+                  <pic:spPr>
+                    <a:xfrm>
+                      <a:off x="0" y="0"/>
+                      <a:ext cx="5274310" cy="3524250"/>
+                    </a:xfrm>
+                    <a:prstGeom prst="rect">
+                      <a:avLst/>
+                    </a:prstGeom>
+                  </pic:spPr>
+                </pic:pic>
+              </a:graphicData>
+            </a:graphic>
+          </wp:inline>
+        </w:drawing>
+      </w:r>
+    </w:p>
+    <w:p>
+      <w:pPr>
+        <w:rPr>
+          <w:rFonts w:hint="eastAsia"/>
+          <w:sz w:val="32"/>
+        </w:rPr>
+      </w:pPr>
+      <w:r>
+        <w:rPr>
+          <w:noProof/>
+        </w:rPr>
+        <w:lastRenderedPageBreak/>
+        <w:drawing>
+          <wp:inline distT="0" distB="0" distL="0" distR="0" wp14:anchorId="27C6413C" wp14:editId="6FA2ED6B">
+            <wp:extent cx="5274310" cy="3524250"/>
+            <wp:effectExtent l="0" t="0" r="2540" b="0"/>
+            <wp:docPr id="1704028807" name="圖片 1"/>
+            <wp:cNvGraphicFramePr>
+              <a:graphicFrameLocks xmlns:a="http://schemas.openxmlformats.org/drawingml/2006/main" noChangeAspect="1"/>
+            </wp:cNvGraphicFramePr>
+            <a:graphic xmlns:a="http://schemas.openxmlformats.org/drawingml/2006/main">
+              <a:graphicData uri="http://schemas.openxmlformats.org/drawingml/2006/picture">
+                <pic:pic xmlns:pic="http://schemas.openxmlformats.org/drawingml/2006/picture">
+                  <pic:nvPicPr>
+                    <pic:cNvPr id="1704028807" name=""/>
+                    <pic:cNvPicPr/>
+                  </pic:nvPicPr>
+                  <pic:blipFill>
+                    <a:blip r:embed="rId9"/>
+                    <a:stretch>
+                      <a:fillRect/>
+                    </a:stretch>
+                  </pic:blipFill>
+                  <pic:spPr>
+                    <a:xfrm>
+                      <a:off x="0" y="0"/>
+                      <a:ext cx="5274310" cy="3524250"/>
+                    </a:xfrm>
+                    <a:prstGeom prst="rect">
+                      <a:avLst/>
+                    </a:prstGeom>
+                  </pic:spPr>
+                </pic:pic>
+              </a:graphicData>
+            </a:graphic>
+          </wp:inline>
+        </w:drawing>
+      </w:r>
+    </w:p>
+    <w:p>
+      <w:pPr>
+        <w:rPr>
+          <w:sz w:val="32"/>
+        </w:rPr>
+      </w:pPr>
+      <w:r>
+        <w:rPr>
           <w:rFonts w:hint="eastAsia"/>
           <w:sz w:val="32"/>
         </w:rPr>
@@ -296,6 +493,82 @@
       </w:pPr>
       <w:r>
         <w:rPr>
+          <w:sz w:val="32"/>
+        </w:rPr>
+        <w:t xml:space="preserve"> </w:t>
+      </w:r>
+    </w:p>
+    <w:p>
+      <w:pPr>
+        <w:rPr>
+          <w:sz w:val="32"/>
+        </w:rPr>
+      </w:pPr>
+    </w:p>
+    <w:p>
+      <w:pPr>
+        <w:rPr>
+          <w:sz w:val="32"/>
+        </w:rPr>
+      </w:pPr>
+    </w:p>
+    <w:p>
+      <w:pPr>
+        <w:rPr>
+          <w:rFonts w:hint="eastAsia"/>
+          <w:sz w:val="32"/>
+        </w:rPr>
+      </w:pPr>
+      <w:r>
+        <w:rPr>
+          <w:sz w:val="32"/>
+        </w:rPr>
+        <w:lastRenderedPageBreak/>
+        <w:drawing>
+          <wp:inline distT="0" distB="0" distL="0" distR="0" wp14:anchorId="242C2840" wp14:editId="2103CE91">
+            <wp:extent cx="5274310" cy="3016250"/>
+            <wp:effectExtent l="0" t="0" r="2540" b="0"/>
+            <wp:docPr id="785664643" name="圖片 1"/>
+            <wp:cNvGraphicFramePr>
+              <a:graphicFrameLocks xmlns:a="http://schemas.openxmlformats.org/drawingml/2006/main" noChangeAspect="1"/>
+            </wp:cNvGraphicFramePr>
+            <a:graphic xmlns:a="http://schemas.openxmlformats.org/drawingml/2006/main">
+              <a:graphicData uri="http://schemas.openxmlformats.org/drawingml/2006/picture">
+                <pic:pic xmlns:pic="http://schemas.openxmlformats.org/drawingml/2006/picture">
+                  <pic:nvPicPr>
+                    <pic:cNvPr id="785664643" name=""/>
+                    <pic:cNvPicPr/>
+                  </pic:nvPicPr>
+                  <pic:blipFill>
+                    <a:blip r:embed="rId10"/>
+                    <a:stretch>
+                      <a:fillRect/>
+                    </a:stretch>
+                  </pic:blipFill>
+                  <pic:spPr>
+                    <a:xfrm>
+                      <a:off x="0" y="0"/>
+                      <a:ext cx="5274310" cy="3016250"/>
+                    </a:xfrm>
+                    <a:prstGeom prst="rect">
+                      <a:avLst/>
+                    </a:prstGeom>
+                  </pic:spPr>
+                </pic:pic>
+              </a:graphicData>
+            </a:graphic>
+          </wp:inline>
+        </w:drawing>
+      </w:r>
+    </w:p>
+    <w:p>
+      <w:pPr>
+        <w:rPr>
+          <w:sz w:val="32"/>
+        </w:rPr>
+      </w:pPr>
+      <w:r>
+        <w:rPr>
           <w:rFonts w:hint="eastAsia"/>
           <w:sz w:val="32"/>
         </w:rPr>
@@ -386,6 +659,142 @@
           <w:sz w:val="32"/>
         </w:rPr>
         <w:t>)</w:t>
+      </w:r>
+    </w:p>
+    <w:p>
+      <w:pPr>
+        <w:rPr>
+          <w:sz w:val="32"/>
+        </w:rPr>
+      </w:pPr>
+    </w:p>
+    <w:p>
+      <w:pPr>
+        <w:rPr>
+          <w:sz w:val="32"/>
+        </w:rPr>
+      </w:pPr>
+      <w:r>
+        <w:rPr>
+          <w:sz w:val="32"/>
+        </w:rPr>
+        <w:t>(Set-ExecutionPolicy -Scope Process -ExecutionPolicy RemoteSigned)</w:t>
+      </w:r>
+    </w:p>
+    <w:p>
+      <w:pPr>
+        <w:rPr>
+          <w:sz w:val="32"/>
+        </w:rPr>
+      </w:pPr>
+      <w:r>
+        <w:rPr>
+          <w:sz w:val="32"/>
+        </w:rPr>
+        <w:drawing>
+          <wp:inline distT="0" distB="0" distL="0" distR="0" wp14:anchorId="7E2D1C7B" wp14:editId="45D7600F">
+            <wp:extent cx="5274310" cy="3296285"/>
+            <wp:effectExtent l="0" t="0" r="2540" b="0"/>
+            <wp:docPr id="184362673" name="圖片 1"/>
+            <wp:cNvGraphicFramePr>
+              <a:graphicFrameLocks xmlns:a="http://schemas.openxmlformats.org/drawingml/2006/main" noChangeAspect="1"/>
+            </wp:cNvGraphicFramePr>
+            <a:graphic xmlns:a="http://schemas.openxmlformats.org/drawingml/2006/main">
+              <a:graphicData uri="http://schemas.openxmlformats.org/drawingml/2006/picture">
+                <pic:pic xmlns:pic="http://schemas.openxmlformats.org/drawingml/2006/picture">
+                  <pic:nvPicPr>
+                    <pic:cNvPr id="184362673" name=""/>
+                    <pic:cNvPicPr/>
+                  </pic:nvPicPr>
+                  <pic:blipFill>
+                    <a:blip r:embed="rId11"/>
+                    <a:stretch>
+                      <a:fillRect/>
+                    </a:stretch>
+                  </pic:blipFill>
+                  <pic:spPr>
+                    <a:xfrm>
+                      <a:off x="0" y="0"/>
+                      <a:ext cx="5274310" cy="3296285"/>
+                    </a:xfrm>
+                    <a:prstGeom prst="rect">
+                      <a:avLst/>
+                    </a:prstGeom>
+                  </pic:spPr>
+                </pic:pic>
+              </a:graphicData>
+            </a:graphic>
+          </wp:inline>
+        </w:drawing>
+      </w:r>
+    </w:p>
+    <w:p>
+      <w:pPr>
+        <w:rPr>
+          <w:sz w:val="32"/>
+        </w:rPr>
+      </w:pPr>
+    </w:p>
+    <w:p>
+      <w:pPr>
+        <w:rPr>
+          <w:sz w:val="32"/>
+        </w:rPr>
+      </w:pPr>
+    </w:p>
+    <w:p>
+      <w:pPr>
+        <w:rPr>
+          <w:sz w:val="32"/>
+        </w:rPr>
+      </w:pPr>
+    </w:p>
+    <w:p>
+      <w:pPr>
+        <w:rPr>
+          <w:rFonts w:hint="eastAsia"/>
+          <w:sz w:val="32"/>
+        </w:rPr>
+      </w:pPr>
+      <w:r>
+        <w:rPr>
+          <w:sz w:val="32"/>
+        </w:rPr>
+        <w:drawing>
+          <wp:inline distT="0" distB="0" distL="0" distR="0" wp14:anchorId="3A41AF32" wp14:editId="52EFE645">
+            <wp:extent cx="5274310" cy="2921000"/>
+            <wp:effectExtent l="0" t="0" r="2540" b="0"/>
+            <wp:docPr id="518504113" name="圖片 1"/>
+            <wp:cNvGraphicFramePr>
+              <a:graphicFrameLocks xmlns:a="http://schemas.openxmlformats.org/drawingml/2006/main" noChangeAspect="1"/>
+            </wp:cNvGraphicFramePr>
+            <a:graphic xmlns:a="http://schemas.openxmlformats.org/drawingml/2006/main">
+              <a:graphicData uri="http://schemas.openxmlformats.org/drawingml/2006/picture">
+                <pic:pic xmlns:pic="http://schemas.openxmlformats.org/drawingml/2006/picture">
+                  <pic:nvPicPr>
+                    <pic:cNvPr id="518504113" name=""/>
+                    <pic:cNvPicPr/>
+                  </pic:nvPicPr>
+                  <pic:blipFill>
+                    <a:blip r:embed="rId12"/>
+                    <a:stretch>
+                      <a:fillRect/>
+                    </a:stretch>
+                  </pic:blipFill>
+                  <pic:spPr>
+                    <a:xfrm>
+                      <a:off x="0" y="0"/>
+                      <a:ext cx="5274310" cy="2921000"/>
+                    </a:xfrm>
+                    <a:prstGeom prst="rect">
+                      <a:avLst/>
+                    </a:prstGeom>
+                  </pic:spPr>
+                </pic:pic>
+              </a:graphicData>
+            </a:graphic>
+          </wp:inline>
+        </w:drawing>
       </w:r>
     </w:p>
     <w:p/>
@@ -400,7 +809,7 @@
 </file>
 
 <file path=word/endnotes.xml><?xml version="1.0" encoding="utf-8"?>
-<w:endnotes xmlns:wpc="http://schemas.microsoft.com/office/word/2010/wordprocessingCanvas" xmlns:cx="http://schemas.microsoft.com/office/drawing/2014/chartex" xmlns:mc="http://schemas.openxmlformats.org/markup-compatibility/2006" xmlns:o="urn:schemas-microsoft-com:office:office" xmlns:r="http://schemas.openxmlformats.org/officeDocument/2006/relationships" xmlns:m="http://schemas.openxmlformats.org/officeDocument/2006/math" xmlns:v="urn:schemas-microsoft-com:vml" xmlns:wp14="http://schemas.microsoft.com/office/word/2010/wordprocessingDrawing" xmlns:wp="http://schemas.openxmlformats.org/drawingml/2006/wordprocessingDrawing" xmlns:w10="urn:schemas-microsoft-com:office:word" xmlns:w="http://schemas.openxmlformats.org/wordprocessingml/2006/main" xmlns:w14="http://schemas.microsoft.com/office/word/2010/wordml" xmlns:w15="http://schemas.microsoft.com/office/word/2012/wordml" xmlns:w16se="http://schemas.microsoft.com/office/word/2015/wordml/symex" xmlns:wpg="http://schemas.microsoft.com/office/word/2010/wordprocessingGroup" xmlns:wpi="http://schemas.microsoft.com/office/word/2010/wordprocessingInk" xmlns:wne="http://schemas.microsoft.com/office/word/2006/wordml" xmlns:wps="http://schemas.microsoft.com/office/word/2010/wordprocessingShape" mc:Ignorable="w14 w15 w16se wp14">
+<w:endnotes xmlns:wpc="http://schemas.microsoft.com/office/word/2010/wordprocessingCanvas" xmlns:cx="http://schemas.microsoft.com/office/drawing/2014/chartex" xmlns:cx1="http://schemas.microsoft.com/office/drawing/2015/9/8/chartex" xmlns:cx2="http://schemas.microsoft.com/office/drawing/2015/10/21/chartex" xmlns:cx3="http://schemas.microsoft.com/office/drawing/2016/5/9/chartex" xmlns:cx4="http://schemas.microsoft.com/office/drawing/2016/5/10/chartex" xmlns:cx5="http://schemas.microsoft.com/office/drawing/2016/5/11/chartex" xmlns:cx6="http://schemas.microsoft.com/office/drawing/2016/5/12/chartex" xmlns:cx7="http://schemas.microsoft.com/office/drawing/2016/5/13/chartex" xmlns:cx8="http://schemas.microsoft.com/office/drawing/2016/5/14/chartex" xmlns:mc="http://schemas.openxmlformats.org/markup-compatibility/2006" xmlns:aink="http://schemas.microsoft.com/office/drawing/2016/ink" xmlns:am3d="http://schemas.microsoft.com/office/drawing/2017/model3d" xmlns:o="urn:schemas-microsoft-com:office:office" xmlns:oel="http://schemas.microsoft.com/office/2019/extlst" xmlns:r="http://schemas.openxmlformats.org/officeDocument/2006/relationships" xmlns:m="http://schemas.openxmlformats.org/officeDocument/2006/math" xmlns:v="urn:schemas-microsoft-com:vml" xmlns:wp14="http://schemas.microsoft.com/office/word/2010/wordprocessingDrawing" xmlns:wp="http://schemas.openxmlformats.org/drawingml/2006/wordprocessingDrawing" xmlns:w10="urn:schemas-microsoft-com:office:word" xmlns:w="http://schemas.openxmlformats.org/wordprocessingml/2006/main" xmlns:w14="http://schemas.microsoft.com/office/word/2010/wordml" xmlns:w15="http://schemas.microsoft.com/office/word/2012/wordml" xmlns:w16cex="http://schemas.microsoft.com/office/word/2018/wordml/cex" xmlns:w16cid="http://schemas.microsoft.com/office/word/2016/wordml/cid" xmlns:w16="http://schemas.microsoft.com/office/word/2018/wordml" xmlns:w16du="http://schemas.microsoft.com/office/word/2023/wordml/word16du" xmlns:w16sdtdh="http://schemas.microsoft.com/office/word/2020/wordml/sdtdatahash" xmlns:w16sdtfl="http://schemas.microsoft.com/office/word/2024/wordml/sdtformatlock" xmlns:w16se="http://schemas.microsoft.com/office/word/2015/wordml/symex" xmlns:wpg="http://schemas.microsoft.com/office/word/2010/wordprocessingGroup" xmlns:wpi="http://schemas.microsoft.com/office/word/2010/wordprocessingInk" xmlns:wne="http://schemas.microsoft.com/office/word/2006/wordml" xmlns:wps="http://schemas.microsoft.com/office/word/2010/wordprocessingShape" mc:Ignorable="w14 w15 w16se w16cid w16 w16cex w16sdtdh w16sdtfl w16du wp14">
   <w:endnote w:type="separator" w:id="-1">
     <w:p>
       <w:r>
@@ -419,7 +828,7 @@
 </file>
 
 <file path=word/footnotes.xml><?xml version="1.0" encoding="utf-8"?>
-<w:footnotes xmlns:wpc="http://schemas.microsoft.com/office/word/2010/wordprocessingCanvas" xmlns:cx="http://schemas.microsoft.com/office/drawing/2014/chartex" xmlns:mc="http://schemas.openxmlformats.org/markup-compatibility/2006" xmlns:o="urn:schemas-microsoft-com:office:office" xmlns:r="http://schemas.openxmlformats.org/officeDocument/2006/relationships" xmlns:m="http://schemas.openxmlformats.org/officeDocument/2006/math" xmlns:v="urn:schemas-microsoft-com:vml" xmlns:wp14="http://schemas.microsoft.com/office/word/2010/wordprocessingDrawing" xmlns:wp="http://schemas.openxmlformats.org/drawingml/2006/wordprocessingDrawing" xmlns:w10="urn:schemas-microsoft-com:office:word" xmlns:w="http://schemas.openxmlformats.org/wordprocessingml/2006/main" xmlns:w14="http://schemas.microsoft.com/office/word/2010/wordml" xmlns:w15="http://schemas.microsoft.com/office/word/2012/wordml" xmlns:w16se="http://schemas.microsoft.com/office/word/2015/wordml/symex" xmlns:wpg="http://schemas.microsoft.com/office/word/2010/wordprocessingGroup" xmlns:wpi="http://schemas.microsoft.com/office/word/2010/wordprocessingInk" xmlns:wne="http://schemas.microsoft.com/office/word/2006/wordml" xmlns:wps="http://schemas.microsoft.com/office/word/2010/wordprocessingShape" mc:Ignorable="w14 w15 w16se wp14">
+<w:footnotes xmlns:wpc="http://schemas.microsoft.com/office/word/2010/wordprocessingCanvas" xmlns:cx="http://schemas.microsoft.com/office/drawing/2014/chartex" xmlns:cx1="http://schemas.microsoft.com/office/drawing/2015/9/8/chartex" xmlns:cx2="http://schemas.microsoft.com/office/drawing/2015/10/21/chartex" xmlns:cx3="http://schemas.microsoft.com/office/drawing/2016/5/9/chartex" xmlns:cx4="http://schemas.microsoft.com/office/drawing/2016/5/10/chartex" xmlns:cx5="http://schemas.microsoft.com/office/drawing/2016/5/11/chartex" xmlns:cx6="http://schemas.microsoft.com/office/drawing/2016/5/12/chartex" xmlns:cx7="http://schemas.microsoft.com/office/drawing/2016/5/13/chartex" xmlns:cx8="http://schemas.microsoft.com/office/drawing/2016/5/14/chartex" xmlns:mc="http://schemas.openxmlformats.org/markup-compatibility/2006" xmlns:aink="http://schemas.microsoft.com/office/drawing/2016/ink" xmlns:am3d="http://schemas.microsoft.com/office/drawing/2017/model3d" xmlns:o="urn:schemas-microsoft-com:office:office" xmlns:oel="http://schemas.microsoft.com/office/2019/extlst" xmlns:r="http://schemas.openxmlformats.org/officeDocument/2006/relationships" xmlns:m="http://schemas.openxmlformats.org/officeDocument/2006/math" xmlns:v="urn:schemas-microsoft-com:vml" xmlns:wp14="http://schemas.microsoft.com/office/word/2010/wordprocessingDrawing" xmlns:wp="http://schemas.openxmlformats.org/drawingml/2006/wordprocessingDrawing" xmlns:w10="urn:schemas-microsoft-com:office:word" xmlns:w="http://schemas.openxmlformats.org/wordprocessingml/2006/main" xmlns:w14="http://schemas.microsoft.com/office/word/2010/wordml" xmlns:w15="http://schemas.microsoft.com/office/word/2012/wordml" xmlns:w16cex="http://schemas.microsoft.com/office/word/2018/wordml/cex" xmlns:w16cid="http://schemas.microsoft.com/office/word/2016/wordml/cid" xmlns:w16="http://schemas.microsoft.com/office/word/2018/wordml" xmlns:w16du="http://schemas.microsoft.com/office/word/2023/wordml/word16du" xmlns:w16sdtdh="http://schemas.microsoft.com/office/word/2020/wordml/sdtdatahash" xmlns:w16sdtfl="http://schemas.microsoft.com/office/word/2024/wordml/sdtformatlock" xmlns:w16se="http://schemas.microsoft.com/office/word/2015/wordml/symex" xmlns:wpg="http://schemas.microsoft.com/office/word/2010/wordprocessingGroup" xmlns:wpi="http://schemas.microsoft.com/office/word/2010/wordprocessingInk" xmlns:wne="http://schemas.microsoft.com/office/word/2006/wordml" xmlns:wps="http://schemas.microsoft.com/office/word/2010/wordprocessingShape" mc:Ignorable="w14 w15 w16se w16cid w16 w16cex w16sdtdh w16sdtfl w16du wp14">
   <w:footnote w:type="separator" w:id="-1">
     <w:p>
       <w:r>
@@ -438,7 +847,7 @@
 </file>
 
 <file path=word/styles.xml><?xml version="1.0" encoding="utf-8"?>
-<w:styles xmlns:mc="http://schemas.openxmlformats.org/markup-compatibility/2006" xmlns:r="http://schemas.openxmlformats.org/officeDocument/2006/relationships" xmlns:w="http://schemas.openxmlformats.org/wordprocessingml/2006/main" xmlns:w14="http://schemas.microsoft.com/office/word/2010/wordml" xmlns:w15="http://schemas.microsoft.com/office/word/2012/wordml" xmlns:w16se="http://schemas.microsoft.com/office/word/2015/wordml/symex" mc:Ignorable="w14 w15 w16se">
+<w:styles xmlns:mc="http://schemas.openxmlformats.org/markup-compatibility/2006" xmlns:r="http://schemas.openxmlformats.org/officeDocument/2006/relationships" xmlns:w="http://schemas.openxmlformats.org/wordprocessingml/2006/main" xmlns:w14="http://schemas.microsoft.com/office/word/2010/wordml" xmlns:w15="http://schemas.microsoft.com/office/word/2012/wordml" xmlns:w16cex="http://schemas.microsoft.com/office/word/2018/wordml/cex" xmlns:w16cid="http://schemas.microsoft.com/office/word/2016/wordml/cid" xmlns:w16="http://schemas.microsoft.com/office/word/2018/wordml" xmlns:w16du="http://schemas.microsoft.com/office/word/2023/wordml/word16du" xmlns:w16sdtdh="http://schemas.microsoft.com/office/word/2020/wordml/sdtdatahash" xmlns:w16sdtfl="http://schemas.microsoft.com/office/word/2024/wordml/sdtformatlock" xmlns:w16se="http://schemas.microsoft.com/office/word/2015/wordml/symex" mc:Ignorable="w14 w15 w16se w16cid w16 w16cex w16sdtdh w16sdtfl w16du">
   <w:docDefaults>
     <w:rPrDefault>
       <w:rPr>
@@ -451,7 +860,7 @@
     </w:rPrDefault>
     <w:pPrDefault/>
   </w:docDefaults>
-  <w:latentStyles w:defLockedState="0" w:defUIPriority="99" w:defSemiHidden="0" w:defUnhideWhenUsed="0" w:defQFormat="0" w:count="371">
+  <w:latentStyles w:defLockedState="0" w:defUIPriority="99" w:defSemiHidden="0" w:defUnhideWhenUsed="0" w:defQFormat="0" w:count="376">
     <w:lsdException w:name="Normal" w:uiPriority="0" w:qFormat="1"/>
     <w:lsdException w:name="heading 1" w:uiPriority="9" w:qFormat="1"/>
     <w:lsdException w:name="heading 2" w:semiHidden="1" w:uiPriority="9" w:unhideWhenUsed="1" w:qFormat="1"/>
@@ -823,6 +1232,11 @@
     <w:lsdException w:name="List Table 5 Dark Accent 6" w:uiPriority="50"/>
     <w:lsdException w:name="List Table 6 Colorful Accent 6" w:uiPriority="51"/>
     <w:lsdException w:name="List Table 7 Colorful Accent 6" w:uiPriority="52"/>
+    <w:lsdException w:name="Mention" w:semiHidden="1" w:unhideWhenUsed="1"/>
+    <w:lsdException w:name="Smart Hyperlink" w:semiHidden="1" w:unhideWhenUsed="1"/>
+    <w:lsdException w:name="Hashtag" w:semiHidden="1" w:unhideWhenUsed="1"/>
+    <w:lsdException w:name="Unresolved Mention" w:semiHidden="1" w:unhideWhenUsed="1"/>
+    <w:lsdException w:name="Smart Link" w:semiHidden="1" w:unhideWhenUsed="1"/>
   </w:latentStyles>
   <w:style w:type="paragraph" w:default="1" w:styleId="a">
     <w:name w:val="Normal"/>

</xml_diff>